<commit_message>
docs(SEG-26): corregir riesgos traslapados de Tarea 3 y ajustar a version final del grupo
Aplica la rubrica real de la profesora (1.1/1.2/1.3/2.1 son los unicos criterios con
puntaje, 1.3 y 2.1 pesan 35 pts cada uno) y separa los riesgos 3 y 4 de la seccion
IDENTIFY, que se traslapaban. El .docx final ya no menciona la Tarea 2 explicitamente
para que se lea como un documento autocontenido.

Co-Authored-By: Claude Sonnet 5 <noreply@anthropic.com>
Claude-Session: https://claude.ai/code/session_01AjV6w7JmDR1BarmncejftC
</commit_message>
<xml_diff>
--- a/Cursos/Seguridad/entregables/Tarea3_NIST_CSF_Grupo11.docx
+++ b/Cursos/Seguridad/entregables/Tarea3_NIST_CSF_Grupo11.docx
@@ -4,8 +4,30 @@
   <w:body>
     <w:p>
       <w:pPr>
-        <w:spacing w:line="360" w:lineRule="auto" w:after="0" w:before="0"/>
-        <w:jc w:val="center"/>
+        <w:spacing w:after="120"/>
+      </w:pPr>
+      <w:r>
+        <w:rPr>
+          <w:b/>
+          <w:sz w:val="26"/>
+        </w:rPr>
+        <w:t>Valor 5% — Tarea #3: Trabajar en Clase, 30 minutos</w:t>
+      </w:r>
+    </w:p>
+    <w:p>
+      <w:pPr>
+        <w:spacing w:after="120"/>
+      </w:pPr>
+      <w:r>
+        <w:rPr>
+          <w:b/>
+        </w:rPr>
+        <w:t>Regresar y exponer en 5 minutos o menos</w:t>
+      </w:r>
+    </w:p>
+    <w:p>
+      <w:pPr>
+        <w:spacing w:after="120"/>
       </w:pPr>
       <w:r>
         <w:rPr>
@@ -15,8 +37,62 @@
     </w:p>
     <w:p>
       <w:pPr>
-        <w:spacing w:line="360" w:lineRule="auto" w:after="0" w:before="0"/>
-        <w:jc w:val="center"/>
+        <w:spacing w:after="120"/>
+      </w:pPr>
+      <w:r>
+        <w:rPr>
+          <w:b/>
+        </w:rPr>
+        <w:t>GRUPO 11</w:t>
+      </w:r>
+    </w:p>
+    <w:p>
+      <w:pPr>
+        <w:spacing w:after="120"/>
+      </w:pPr>
+      <w:r>
+        <w:rPr>
+          <w:b w:val="0"/>
+        </w:rPr>
+        <w:t>Rachel Monterrey Quesada</w:t>
+      </w:r>
+    </w:p>
+    <w:p>
+      <w:pPr>
+        <w:spacing w:after="120"/>
+      </w:pPr>
+      <w:r>
+        <w:rPr>
+          <w:b w:val="0"/>
+        </w:rPr>
+        <w:t>Wesley Esquivel Mena</w:t>
+      </w:r>
+    </w:p>
+    <w:p>
+      <w:pPr>
+        <w:spacing w:after="120"/>
+      </w:pPr>
+      <w:r>
+        <w:rPr>
+          <w:b w:val="0"/>
+        </w:rPr>
+        <w:t>Marcos Zamora Sanchez</w:t>
+      </w:r>
+    </w:p>
+    <w:p>
+      <w:pPr>
+        <w:spacing w:after="120"/>
+      </w:pPr>
+      <w:r>
+        <w:rPr>
+          <w:b w:val="0"/>
+        </w:rPr>
+        <w:t>Dereck Yariel Cuadra Gonzalez</w:t>
+      </w:r>
+    </w:p>
+    <w:p>
+      <w:pPr>
+        <w:spacing w:after="120"/>
       </w:pPr>
       <w:r>
         <w:rPr>
@@ -26,8 +102,30 @@
     </w:p>
     <w:p>
       <w:pPr>
-        <w:spacing w:line="360" w:lineRule="auto" w:after="0" w:before="0"/>
-        <w:jc w:val="center"/>
+        <w:spacing w:after="120"/>
+      </w:pPr>
+      <w:r>
+        <w:rPr>
+          <w:b/>
+        </w:rPr>
+        <w:t>Objetivo</w:t>
+      </w:r>
+    </w:p>
+    <w:p>
+      <w:pPr>
+        <w:spacing w:after="120"/>
+        <w:jc w:val="both"/>
+      </w:pPr>
+      <w:r>
+        <w:rPr>
+          <w:b w:val="0"/>
+        </w:rPr>
+        <w:t>Aplicar las funciones del NIST Cybersecurity Framework (CSF) para analizar los riesgos de ciberseguridad y proponer controles para proteger los datos de clientes en una empresa ficticia.</w:t>
+      </w:r>
+    </w:p>
+    <w:p>
+      <w:pPr>
+        <w:spacing w:after="120"/>
       </w:pPr>
       <w:r>
         <w:rPr>
@@ -37,224 +135,7 @@
     </w:p>
     <w:p>
       <w:pPr>
-        <w:spacing w:line="360" w:lineRule="auto" w:after="0" w:before="0"/>
-        <w:jc w:val="center"/>
-      </w:pPr>
-      <w:r>
-        <w:rPr>
-          <w:b/>
-        </w:rPr>
-        <w:t>INSTITUTO TECNOLÓGICO DE COSTA RICA</w:t>
-      </w:r>
-    </w:p>
-    <w:p>
-      <w:pPr>
-        <w:spacing w:line="360" w:lineRule="auto" w:after="0" w:before="0"/>
-        <w:jc w:val="center"/>
-      </w:pPr>
-      <w:r>
-        <w:rPr>
-          <w:b/>
-        </w:rPr>
-        <w:t>Escuela de Ingeniería en Computación</w:t>
-      </w:r>
-    </w:p>
-    <w:p>
-      <w:pPr>
-        <w:spacing w:line="360" w:lineRule="auto" w:after="0" w:before="0"/>
-        <w:jc w:val="center"/>
-      </w:pPr>
-      <w:r>
-        <w:rPr>
-          <w:b/>
-        </w:rPr>
-        <w:t>Seguridad del Software</w:t>
-      </w:r>
-    </w:p>
-    <w:p>
-      <w:pPr>
-        <w:spacing w:line="360" w:lineRule="auto" w:after="0" w:before="0"/>
-        <w:jc w:val="center"/>
-      </w:pPr>
-      <w:r>
-        <w:rPr>
-          <w:b w:val="0"/>
-        </w:rPr>
-      </w:r>
-    </w:p>
-    <w:p>
-      <w:pPr>
-        <w:spacing w:line="360" w:lineRule="auto" w:after="0" w:before="0"/>
-        <w:jc w:val="center"/>
-      </w:pPr>
-      <w:r>
-        <w:rPr>
-          <w:b w:val="0"/>
-        </w:rPr>
-      </w:r>
-    </w:p>
-    <w:p>
-      <w:pPr>
-        <w:spacing w:line="360" w:lineRule="auto" w:after="0" w:before="0"/>
-        <w:jc w:val="center"/>
-      </w:pPr>
-      <w:r>
-        <w:rPr>
-          <w:b w:val="0"/>
-        </w:rPr>
-      </w:r>
-    </w:p>
-    <w:p>
-      <w:pPr>
-        <w:spacing w:line="360" w:lineRule="auto" w:after="0" w:before="0"/>
-        <w:jc w:val="center"/>
-      </w:pPr>
-      <w:r>
-        <w:rPr>
-          <w:b/>
-        </w:rPr>
-        <w:t>Tarea 3 — NIST Cybersecurity Framework (CSF)</w:t>
-      </w:r>
-    </w:p>
-    <w:p>
-      <w:pPr>
-        <w:spacing w:line="360" w:lineRule="auto" w:after="0" w:before="0"/>
-        <w:jc w:val="center"/>
-      </w:pPr>
-      <w:r>
-        <w:rPr>
-          <w:b w:val="0"/>
-        </w:rPr>
-        <w:t>Caso VoteOnline (Votación Institucional)</w:t>
-      </w:r>
-    </w:p>
-    <w:p>
-      <w:pPr>
-        <w:spacing w:line="360" w:lineRule="auto" w:after="0" w:before="0"/>
-        <w:jc w:val="center"/>
-      </w:pPr>
-      <w:r>
-        <w:rPr>
-          <w:b w:val="0"/>
-        </w:rPr>
-        <w:t>Trabajo en clase, 30 minutos</w:t>
-      </w:r>
-    </w:p>
-    <w:p>
-      <w:pPr>
-        <w:spacing w:line="360" w:lineRule="auto" w:after="0" w:before="0"/>
-        <w:jc w:val="center"/>
-      </w:pPr>
-      <w:r>
-        <w:rPr>
-          <w:b w:val="0"/>
-        </w:rPr>
-      </w:r>
-    </w:p>
-    <w:p>
-      <w:pPr>
-        <w:spacing w:line="360" w:lineRule="auto" w:after="0" w:before="0"/>
-        <w:jc w:val="center"/>
-      </w:pPr>
-      <w:r>
-        <w:rPr>
-          <w:b w:val="0"/>
-        </w:rPr>
-      </w:r>
-    </w:p>
-    <w:p>
-      <w:pPr>
-        <w:spacing w:line="360" w:lineRule="auto" w:after="0" w:before="0"/>
-        <w:jc w:val="center"/>
-      </w:pPr>
-      <w:r>
-        <w:rPr>
-          <w:b/>
-          <w:i w:val="0"/>
-        </w:rPr>
-        <w:t xml:space="preserve">Estudiante: </w:t>
-      </w:r>
-      <w:r>
-        <w:rPr>
-          <w:b w:val="0"/>
-          <w:i w:val="0"/>
-        </w:rPr>
-        <w:t>Marcos Zamora Sánchez</w:t>
-      </w:r>
-    </w:p>
-    <w:p>
-      <w:pPr>
-        <w:spacing w:line="360" w:lineRule="auto" w:after="0" w:before="0"/>
-        <w:jc w:val="center"/>
-      </w:pPr>
-      <w:r>
-        <w:rPr>
-          <w:b/>
-          <w:i w:val="0"/>
-        </w:rPr>
-        <w:t xml:space="preserve">Profesora: </w:t>
-      </w:r>
-      <w:r>
-        <w:rPr>
-          <w:b w:val="0"/>
-          <w:i w:val="0"/>
-        </w:rPr>
-        <w:t>Adriana Rojas Chavarría</w:t>
-      </w:r>
-    </w:p>
-    <w:p>
-      <w:pPr>
-        <w:spacing w:line="360" w:lineRule="auto" w:after="0" w:before="0"/>
-        <w:jc w:val="center"/>
-      </w:pPr>
-      <w:r>
-        <w:rPr>
-          <w:b/>
-          <w:i w:val="0"/>
-        </w:rPr>
-        <w:t xml:space="preserve">Grupo: </w:t>
-      </w:r>
-      <w:r>
-        <w:rPr>
-          <w:b w:val="0"/>
-          <w:i w:val="0"/>
-        </w:rPr>
-        <w:t>11</w:t>
-      </w:r>
-    </w:p>
-    <w:p>
-      <w:pPr>
-        <w:spacing w:line="360" w:lineRule="auto" w:after="0" w:before="0"/>
-        <w:jc w:val="center"/>
-      </w:pPr>
-      <w:r>
-        <w:rPr>
-          <w:b/>
-          <w:i w:val="0"/>
-        </w:rPr>
-        <w:t xml:space="preserve">Fecha: </w:t>
-      </w:r>
-      <w:r>
-        <w:rPr>
-          <w:b w:val="0"/>
-          <w:i w:val="0"/>
-        </w:rPr>
-        <w:t>7 de setiembre de 2026</w:t>
-      </w:r>
-    </w:p>
-    <w:p>
-      <w:pPr>
-        <w:spacing w:line="360" w:lineRule="auto" w:after="0" w:before="0"/>
-      </w:pPr>
-      <w:r>
-        <w:rPr>
-          <w:b w:val="0"/>
-        </w:rPr>
-      </w:r>
-    </w:p>
-    <w:p>
-      <w:pPr>
-        <w:spacing w:line="360" w:lineRule="auto" w:after="0" w:before="0"/>
+        <w:spacing w:after="120"/>
       </w:pPr>
       <w:r>
         <w:rPr>
@@ -265,19 +146,19 @@
     </w:p>
     <w:p>
       <w:pPr>
-        <w:spacing w:line="360" w:lineRule="auto" w:after="0" w:before="0"/>
+        <w:spacing w:after="120"/>
         <w:jc w:val="both"/>
       </w:pPr>
       <w:r>
         <w:rPr>
           <w:b w:val="0"/>
         </w:rPr>
-        <w:t>VoteOnline es un sistema web de elecciones remotas para colegios profesionales, ya analizado en la Tarea 2 (Threat Modeling). El votante recibe un token de un solo uso por correo, generado a partir de su número de cédula mediante SHA-1 sin sal, lo que permite predecir los tokens de otros votantes. El sistema guarda el ID del votante junto a la opción elegida en la misma tabla de la base de datos, y un panel de administración protegido solo por una cookie de sesión (sin flag HttpOnly) permite auditar la base de datos. Recientemente la empresa detectó intentos de acceso no autorizado y quiere mejorar su postura de ciberseguridad aplicando el NIST Cybersecurity Framework.</w:t>
+        <w:t>VoteOnline: sistema web de elecciones remotas para colegios profesionales. Recientemente la empresa detectó intentos de acceso no autorizado y quiere mejorar su postura de ciberseguridad utilizando el NIST Cybersecurity Framework.</w:t>
       </w:r>
     </w:p>
     <w:p>
       <w:pPr>
-        <w:spacing w:line="360" w:lineRule="auto" w:after="0" w:before="0"/>
+        <w:spacing w:after="120"/>
       </w:pPr>
       <w:r>
         <w:rPr>
@@ -287,7 +168,40 @@
     </w:p>
     <w:p>
       <w:pPr>
-        <w:spacing w:line="360" w:lineRule="auto" w:after="0" w:before="0"/>
+        <w:spacing w:after="120"/>
+      </w:pPr>
+      <w:r>
+        <w:rPr>
+          <w:b/>
+        </w:rPr>
+        <w:t>Instrucciones</w:t>
+      </w:r>
+    </w:p>
+    <w:p>
+      <w:pPr>
+        <w:spacing w:after="120"/>
+        <w:jc w:val="both"/>
+      </w:pPr>
+      <w:r>
+        <w:rPr>
+          <w:b w:val="0"/>
+        </w:rPr>
+        <w:t>Analice el escenario y responda las siguientes secciones aplicando las funciones del NIST CSF.</w:t>
+      </w:r>
+    </w:p>
+    <w:p>
+      <w:pPr>
+        <w:spacing w:after="120"/>
+      </w:pPr>
+      <w:r>
+        <w:rPr>
+          <w:b w:val="0"/>
+        </w:rPr>
+      </w:r>
+    </w:p>
+    <w:p>
+      <w:pPr>
+        <w:spacing w:after="120"/>
       </w:pPr>
       <w:r>
         <w:rPr>
@@ -298,31 +212,25 @@
     </w:p>
     <w:p>
       <w:pPr>
-        <w:spacing w:line="360" w:lineRule="auto" w:after="0" w:before="0"/>
+        <w:spacing w:after="120"/>
       </w:pPr>
       <w:r>
         <w:rPr>
           <w:b/>
         </w:rPr>
-        <w:t>1.1 Cuatro activos críticos:</w:t>
+        <w:t>1.1 Liste 4 activos críticos de la empresa:</w:t>
       </w:r>
     </w:p>
     <w:p>
       <w:pPr>
-        <w:spacing w:line="360" w:lineRule="auto" w:after="120"/>
+        <w:spacing w:after="120"/>
         <w:jc w:val="both"/>
       </w:pPr>
       <w:r>
         <w:rPr>
-          <w:b w:val="0"/>
-        </w:rPr>
-        <w:t xml:space="preserve">1. </w:t>
-      </w:r>
-      <w:r>
-        <w:rPr>
           <w:b/>
         </w:rPr>
-        <w:t xml:space="preserve">Token del votante — </w:t>
+        <w:t xml:space="preserve">1. Token del votante: </w:t>
       </w:r>
       <w:r>
         <w:t>es la credencial que autoriza un voto; si se compromete, se puede suplantar a cualquier colegiado.</w:t>
@@ -330,20 +238,14 @@
     </w:p>
     <w:p>
       <w:pPr>
-        <w:spacing w:line="360" w:lineRule="auto" w:after="120"/>
+        <w:spacing w:after="120"/>
         <w:jc w:val="both"/>
       </w:pPr>
       <w:r>
         <w:rPr>
-          <w:b w:val="0"/>
-        </w:rPr>
-        <w:t xml:space="preserve">2. </w:t>
-      </w:r>
-      <w:r>
-        <w:rPr>
           <w:b/>
         </w:rPr>
-        <w:t xml:space="preserve">ID del votante vinculado al voto (misma tabla) — </w:t>
+        <w:t xml:space="preserve">2. ID del votante vinculado al voto (misma tabla): </w:t>
       </w:r>
       <w:r>
         <w:t>de esto depende el secreto del voto.</w:t>
@@ -351,20 +253,14 @@
     </w:p>
     <w:p>
       <w:pPr>
-        <w:spacing w:line="360" w:lineRule="auto" w:after="120"/>
+        <w:spacing w:after="120"/>
         <w:jc w:val="both"/>
       </w:pPr>
       <w:r>
         <w:rPr>
-          <w:b w:val="0"/>
-        </w:rPr>
-        <w:t xml:space="preserve">3. </w:t>
-      </w:r>
-      <w:r>
-        <w:rPr>
           <w:b/>
         </w:rPr>
-        <w:t xml:space="preserve">Base de datos electoral — </w:t>
+        <w:t xml:space="preserve">3. Base de datos electoral: </w:t>
       </w:r>
       <w:r>
         <w:t>contiene el resultado completo de la elección.</w:t>
@@ -372,20 +268,14 @@
     </w:p>
     <w:p>
       <w:pPr>
-        <w:spacing w:line="360" w:lineRule="auto" w:after="120"/>
+        <w:spacing w:after="120"/>
         <w:jc w:val="both"/>
       </w:pPr>
       <w:r>
         <w:rPr>
-          <w:b w:val="0"/>
-        </w:rPr>
-        <w:t xml:space="preserve">4. </w:t>
-      </w:r>
-      <w:r>
-        <w:rPr>
           <w:b/>
         </w:rPr>
-        <w:t xml:space="preserve">Panel de administración / cookie de sesión — </w:t>
+        <w:t xml:space="preserve">4. Panel de administración / cookie de sesión: </w:t>
       </w:r>
       <w:r>
         <w:t>es la puerta de acceso con más privilegio a todo lo anterior.</w:t>
@@ -393,125 +283,7 @@
     </w:p>
     <w:p>
       <w:pPr>
-        <w:spacing w:line="360" w:lineRule="auto" w:after="0" w:before="0"/>
-      </w:pPr>
-      <w:r>
-        <w:rPr>
-          <w:b/>
-        </w:rPr>
-        <w:t>1.2 Datos de clientes (colegiados) que deben protegerse:</w:t>
-      </w:r>
-    </w:p>
-    <w:p>
-      <w:pPr>
-        <w:spacing w:line="360" w:lineRule="auto" w:after="0" w:before="0"/>
-        <w:jc w:val="both"/>
-      </w:pPr>
-      <w:r>
-        <w:rPr>
-          <w:b w:val="0"/>
-        </w:rPr>
-        <w:t>Número de cédula (semilla del token), correo electrónico (canal de entrega del token), y el voto emitido junto con su vínculo al votante — este último es el dato más sensible del sistema, porque revela cómo votó una persona específica.</w:t>
-      </w:r>
-    </w:p>
-    <w:p>
-      <w:pPr>
-        <w:spacing w:line="360" w:lineRule="auto" w:after="0" w:before="0"/>
-      </w:pPr>
-      <w:r>
-        <w:rPr>
-          <w:b/>
-        </w:rPr>
-        <w:t>1.3 Cuatro riesgos de seguridad y por qué lo son:</w:t>
-      </w:r>
-    </w:p>
-    <w:p>
-      <w:pPr>
-        <w:spacing w:line="360" w:lineRule="auto" w:after="120"/>
-        <w:jc w:val="both"/>
-      </w:pPr>
-      <w:r>
-        <w:rPr>
-          <w:b w:val="0"/>
-        </w:rPr>
-        <w:t xml:space="preserve">1. </w:t>
-      </w:r>
-      <w:r>
-        <w:rPr>
-          <w:b/>
-        </w:rPr>
-        <w:t xml:space="preserve">Predicción de tokens (SHA-1 sin sal sobre la cédula) — </w:t>
-      </w:r>
-      <w:r>
-        <w:t>es riesgo porque la cédula es semi-pública en Costa Rica; un atacante externo puede calcular el token de otro colegiado sin acceso privilegiado ni interceptar nada.</w:t>
-      </w:r>
-    </w:p>
-    <w:p>
-      <w:pPr>
-        <w:spacing w:line="360" w:lineRule="auto" w:after="120"/>
-        <w:jc w:val="both"/>
-      </w:pPr>
-      <w:r>
-        <w:rPr>
-          <w:b w:val="0"/>
-        </w:rPr>
-        <w:t xml:space="preserve">2. </w:t>
-      </w:r>
-      <w:r>
-        <w:rPr>
-          <w:b/>
-        </w:rPr>
-        <w:t xml:space="preserve">Cookie de sesión del panel sin HttpOnly — </w:t>
-      </w:r>
-      <w:r>
-        <w:t>es riesgo porque es robable vía XSS, y esa sola cookie da acceso de auditoría a toda la base de datos electoral.</w:t>
-      </w:r>
-    </w:p>
-    <w:p>
-      <w:pPr>
-        <w:spacing w:line="360" w:lineRule="auto" w:after="120"/>
-        <w:jc w:val="both"/>
-      </w:pPr>
-      <w:r>
-        <w:rPr>
-          <w:b w:val="0"/>
-        </w:rPr>
-        <w:t xml:space="preserve">3. </w:t>
-      </w:r>
-      <w:r>
-        <w:rPr>
-          <w:b/>
-        </w:rPr>
-        <w:t xml:space="preserve">Un administrador legítimo puede ver qué votó una persona específica (voto e ID en la misma tabla) — </w:t>
-      </w:r>
-      <w:r>
-        <w:t>es riesgo aunque no haya atacante externo: rompe el secreto del voto desde adentro, con acceso completamente autorizado.</w:t>
-      </w:r>
-    </w:p>
-    <w:p>
-      <w:pPr>
-        <w:spacing w:line="360" w:lineRule="auto" w:after="120"/>
-        <w:jc w:val="both"/>
-      </w:pPr>
-      <w:r>
-        <w:rPr>
-          <w:b w:val="0"/>
-        </w:rPr>
-        <w:t xml:space="preserve">4. </w:t>
-      </w:r>
-      <w:r>
-        <w:rPr>
-          <w:b/>
-        </w:rPr>
-        <w:t xml:space="preserve">El canal de correo (proveedor externo) puede ser interceptado — </w:t>
-      </w:r>
-      <w:r>
-        <w:t>es riesgo porque el token viaja hacia un tercero fuera del control del colegio, sin garantía de confidencialidad.</w:t>
-      </w:r>
-    </w:p>
-    <w:p>
-      <w:pPr>
-        <w:spacing w:line="360" w:lineRule="auto" w:after="0" w:before="0"/>
+        <w:spacing w:after="120"/>
       </w:pPr>
       <w:r>
         <w:rPr>
@@ -521,7 +293,97 @@
     </w:p>
     <w:p>
       <w:pPr>
-        <w:spacing w:line="360" w:lineRule="auto" w:after="0" w:before="0"/>
+        <w:spacing w:after="120"/>
+      </w:pPr>
+      <w:r>
+        <w:rPr>
+          <w:b/>
+        </w:rPr>
+        <w:t>1.2 ¿Qué tipos de datos de clientes deben protegerse?</w:t>
+      </w:r>
+    </w:p>
+    <w:p>
+      <w:pPr>
+        <w:spacing w:after="120"/>
+        <w:jc w:val="both"/>
+      </w:pPr>
+      <w:r>
+        <w:rPr>
+          <w:b w:val="0"/>
+        </w:rPr>
+        <w:t>El voto de los colegiados y sus datos personales (cédula y correo electrónico), ya que permiten identificar a la persona y vincularla con su elección.</w:t>
+      </w:r>
+    </w:p>
+    <w:p>
+      <w:pPr>
+        <w:spacing w:after="120"/>
+      </w:pPr>
+      <w:r>
+        <w:rPr>
+          <w:b w:val="0"/>
+        </w:rPr>
+      </w:r>
+    </w:p>
+    <w:p>
+      <w:pPr>
+        <w:spacing w:after="120"/>
+      </w:pPr>
+      <w:r>
+        <w:rPr>
+          <w:b/>
+        </w:rPr>
+        <w:t>1.3 Identifique al menos cuatro riesgos de seguridad y explique por qué son riesgos:</w:t>
+      </w:r>
+    </w:p>
+    <w:p>
+      <w:pPr>
+        <w:spacing w:after="120"/>
+        <w:jc w:val="both"/>
+      </w:pPr>
+      <w:r>
+        <w:t>1. El acceso al panel de administración solo está protegido por una cookie de sesión. Es un riesgo porque, si esa cookie se roba, cualquier persona puede entrar al sistema como administrador y auditar toda la base de datos electoral.</w:t>
+      </w:r>
+    </w:p>
+    <w:p>
+      <w:pPr>
+        <w:spacing w:after="120"/>
+        <w:jc w:val="both"/>
+      </w:pPr>
+      <w:r>
+        <w:t>2. Que se pierda el secreto del voto. Si la base de datos guarda el ID del colegiado junto con el voto que hizo, cualquier persona con acceso al sistema podría ver por quién votó cada colegiado.</w:t>
+      </w:r>
+    </w:p>
+    <w:p>
+      <w:pPr>
+        <w:spacing w:after="120"/>
+        <w:jc w:val="both"/>
+      </w:pPr>
+      <w:r>
+        <w:t>3. Que el token para votar se prediga o se filtre y se use para votar suplantando la identidad de otro colegiado. Es un riesgo porque permite que alguien emita un voto en nombre de otra persona sin su consentimiento, afectando la autenticidad y la integridad del proceso electoral.</w:t>
+      </w:r>
+    </w:p>
+    <w:p>
+      <w:pPr>
+        <w:spacing w:after="120"/>
+        <w:jc w:val="both"/>
+      </w:pPr>
+      <w:r>
+        <w:t>4. Que un administrador con acceso legítimo al panel modifique o elimine votos directamente en la base de datos antes de que cierre la elección. Es un riesgo porque no hace falta robar nada: el mismo acceso autorizado que sirve para auditar la elección también permite alterar el resultado, lo que puede convertir la votación en un proceso fraudulento.</w:t>
+      </w:r>
+    </w:p>
+    <w:p>
+      <w:pPr>
+        <w:spacing w:after="120"/>
+      </w:pPr>
+      <w:r>
+        <w:rPr>
+          <w:b w:val="0"/>
+        </w:rPr>
+      </w:r>
+    </w:p>
+    <w:p>
+      <w:pPr>
+        <w:spacing w:after="120"/>
       </w:pPr>
       <w:r>
         <w:rPr>
@@ -532,31 +394,25 @@
     </w:p>
     <w:p>
       <w:pPr>
-        <w:spacing w:line="360" w:lineRule="auto" w:after="0" w:before="0"/>
+        <w:spacing w:after="120"/>
       </w:pPr>
       <w:r>
         <w:rPr>
           <w:b/>
         </w:rPr>
-        <w:t>2.1 Cuatro controles de acceso y por qué deben implementarse:</w:t>
+        <w:t>2.1 Cite 4 controles de acceso que deberían implementarse y por qué:</w:t>
       </w:r>
     </w:p>
     <w:p>
       <w:pPr>
-        <w:spacing w:line="360" w:lineRule="auto" w:after="120"/>
+        <w:spacing w:after="120"/>
         <w:jc w:val="both"/>
       </w:pPr>
       <w:r>
         <w:rPr>
-          <w:b w:val="0"/>
-        </w:rPr>
-        <w:t xml:space="preserve">1. </w:t>
-      </w:r>
-      <w:r>
-        <w:rPr>
           <w:b/>
         </w:rPr>
-        <w:t xml:space="preserve">MFA en el panel de administración — </w:t>
+        <w:t xml:space="preserve">1. MFA en el panel de administración: </w:t>
       </w:r>
       <w:r>
         <w:t>hoy basta con robar una cookie para auditar toda la elección; un segundo factor rompe ese ataque de un solo paso.</w:t>
@@ -564,164 +420,52 @@
     </w:p>
     <w:p>
       <w:pPr>
-        <w:spacing w:line="360" w:lineRule="auto" w:after="120"/>
+        <w:spacing w:after="120"/>
         <w:jc w:val="both"/>
-      </w:pPr>
-      <w:r>
-        <w:rPr>
-          <w:b w:val="0"/>
-        </w:rPr>
-        <w:t xml:space="preserve">2. </w:t>
-      </w:r>
-      <w:r>
-        <w:rPr>
-          <w:b/>
-        </w:rPr>
-        <w:t xml:space="preserve">Mínimo privilegio por rol — </w:t>
-      </w:r>
-      <w:r>
-        <w:t>separar “ver participación” de “ver resultado por persona”, porque hoy cualquier admin puede ver el voto individual de alguien.</w:t>
-      </w:r>
-    </w:p>
-    <w:p>
-      <w:pPr>
-        <w:spacing w:line="360" w:lineRule="auto" w:after="120"/>
-        <w:jc w:val="both"/>
-      </w:pPr>
-      <w:r>
-        <w:rPr>
-          <w:b w:val="0"/>
-        </w:rPr>
-        <w:t xml:space="preserve">3. </w:t>
-      </w:r>
-      <w:r>
-        <w:rPr>
-          <w:b/>
-        </w:rPr>
-        <w:t xml:space="preserve">Autenticación del votante más allá del token derivado de cédula — </w:t>
-      </w:r>
-      <w:r>
-        <w:t>ataca directamente el riesgo de predicción de tokens.</w:t>
-      </w:r>
-    </w:p>
-    <w:p>
-      <w:pPr>
-        <w:spacing w:line="360" w:lineRule="auto" w:after="120"/>
-        <w:jc w:val="both"/>
-      </w:pPr>
-      <w:r>
-        <w:rPr>
-          <w:b w:val="0"/>
-        </w:rPr>
-        <w:t xml:space="preserve">4. </w:t>
-      </w:r>
-      <w:r>
-        <w:rPr>
-          <w:b/>
-        </w:rPr>
-        <w:t xml:space="preserve">Separación de tablas (quién votó vs. qué se votó) — </w:t>
-      </w:r>
-      <w:r>
-        <w:t>es control de acceso a nivel de dato: ni un admin con acceso total a una tabla puede reconstruir el secreto del voto.</w:t>
-      </w:r>
-    </w:p>
-    <w:p>
-      <w:pPr>
-        <w:spacing w:line="360" w:lineRule="auto" w:after="0" w:before="0"/>
       </w:pPr>
       <w:r>
         <w:rPr>
           <w:b/>
         </w:rPr>
-        <w:t>2.2 Cómo proteger los datos de clientes / cambios de diseño de la aplicación:</w:t>
+        <w:t xml:space="preserve">2. Mínimo privilegio por rol: </w:t>
+      </w:r>
+      <w:r>
+        <w:t>separar “ver participación” de “ver resultado por persona”, porque hoy cualquier administrador puede ver el voto individual de alguien.</w:t>
       </w:r>
     </w:p>
     <w:p>
       <w:pPr>
-        <w:spacing w:line="360" w:lineRule="auto" w:after="0" w:before="0"/>
+        <w:spacing w:after="120"/>
         <w:jc w:val="both"/>
-      </w:pPr>
-      <w:r>
-        <w:rPr>
-          <w:b w:val="0"/>
-        </w:rPr>
-        <w:t>Cifrado en tránsito (TLS) en todo el tráfico votante-servidor-correo, cifrado en reposo de la tabla electoral, y el rediseño ya identificado en Tarea 2: separar “ID de quién votó” de “qué opción se eligió” en dos tablas unidas solo por un token efímero que se destruye al cerrar la elección. Además, reemplazar SHA-1 sin sal por HMAC-SHA256 con clave secreta del servidor y salt único por token.</w:t>
-      </w:r>
-    </w:p>
-    <w:p>
-      <w:pPr>
-        <w:spacing w:line="360" w:lineRule="auto" w:after="0" w:before="0"/>
       </w:pPr>
       <w:r>
         <w:rPr>
           <w:b/>
         </w:rPr>
-        <w:t>2.3 Cuatro medidas de capacitación para empleados:</w:t>
+        <w:t xml:space="preserve">3. Autenticación del votante más allá del token derivado de la cédula: </w:t>
+      </w:r>
+      <w:r>
+        <w:t>mitiga directamente el riesgo de predicción de tokens.</w:t>
       </w:r>
     </w:p>
     <w:p>
       <w:pPr>
-        <w:spacing w:line="360" w:lineRule="auto" w:after="120"/>
+        <w:spacing w:after="120"/>
         <w:jc w:val="both"/>
       </w:pPr>
       <w:r>
         <w:rPr>
-          <w:b w:val="0"/>
+          <w:b/>
         </w:rPr>
-        <w:t xml:space="preserve">1. </w:t>
+        <w:t xml:space="preserve">4. Separación de tablas (quién votó frente a qué se votó): </w:t>
       </w:r>
       <w:r>
-        <w:t>Capacitar al comité electoral en manejo de datos sensibles y en no consultar resultados individuales sin que quede registrado el motivo.</w:t>
+        <w:t>es un control de acceso a nivel de dato, porque ni un administrador con acceso total a una tabla puede reconstruir el secreto del voto.</w:t>
       </w:r>
     </w:p>
     <w:p>
       <w:pPr>
-        <w:spacing w:line="360" w:lineRule="auto" w:after="120"/>
-        <w:jc w:val="both"/>
-      </w:pPr>
-      <w:r>
-        <w:rPr>
-          <w:b w:val="0"/>
-        </w:rPr>
-        <w:t xml:space="preserve">2. </w:t>
-      </w:r>
-      <w:r>
-        <w:t>Capacitación en phishing dirigida a votantes, para reconocer un correo falso de “token de votación”.</w:t>
-      </w:r>
-    </w:p>
-    <w:p>
-      <w:pPr>
-        <w:spacing w:line="360" w:lineRule="auto" w:after="120"/>
-        <w:jc w:val="both"/>
-      </w:pPr>
-      <w:r>
-        <w:rPr>
-          <w:b w:val="0"/>
-        </w:rPr>
-        <w:t xml:space="preserve">3. </w:t>
-      </w:r>
-      <w:r>
-        <w:t>Capacitación técnica al equipo de desarrollo sobre por qué SHA-1 sin sal es inseguro y sobre flags de cookie seguras (HttpOnly, Secure, SameSite).</w:t>
-      </w:r>
-    </w:p>
-    <w:p>
-      <w:pPr>
-        <w:spacing w:line="360" w:lineRule="auto" w:after="120"/>
-        <w:jc w:val="both"/>
-      </w:pPr>
-      <w:r>
-        <w:rPr>
-          <w:b w:val="0"/>
-        </w:rPr>
-        <w:t xml:space="preserve">4. </w:t>
-      </w:r>
-      <w:r>
-        <w:t>Simulacros internos de respuesta a incidentes para el equipo técnico del colegio, antes de que ocurra uno real.</w:t>
-      </w:r>
-    </w:p>
-    <w:p>
-      <w:pPr>
-        <w:spacing w:line="360" w:lineRule="auto" w:after="0" w:before="0"/>
+        <w:spacing w:after="120"/>
       </w:pPr>
       <w:r>
         <w:rPr>
@@ -731,7 +475,97 @@
     </w:p>
     <w:p>
       <w:pPr>
-        <w:spacing w:line="360" w:lineRule="auto" w:after="0" w:before="0"/>
+        <w:spacing w:after="120"/>
+      </w:pPr>
+      <w:r>
+        <w:rPr>
+          <w:b/>
+        </w:rPr>
+        <w:t>2.2 ¿Cómo deberían protegerse los datos de clientes? ¿Qué cambios en el diseño de la aplicación deberían aplicarse para proteger esos datos?</w:t>
+      </w:r>
+    </w:p>
+    <w:p>
+      <w:pPr>
+        <w:spacing w:after="120"/>
+        <w:jc w:val="both"/>
+      </w:pPr>
+      <w:r>
+        <w:rPr>
+          <w:b w:val="0"/>
+        </w:rPr>
+        <w:t>Implementación de cifrado TLS para asegurar la comunicación entre votante, servidor y correo, junto con cifrado en reposo para los registros electorales. Se requiere además separar la identidad del votante de su elección mediante tablas independientes, conectadas solo por un identificador efímero que se elimina al cerrar la elección. Finalmente, sustituir el uso de SHA-1 por HMAC-SHA256, incorporando una llave privada del servidor y un valor salt exclusivo por cada token generado.</w:t>
+      </w:r>
+    </w:p>
+    <w:p>
+      <w:pPr>
+        <w:spacing w:after="120"/>
+      </w:pPr>
+      <w:r>
+        <w:rPr>
+          <w:b w:val="0"/>
+        </w:rPr>
+      </w:r>
+    </w:p>
+    <w:p>
+      <w:pPr>
+        <w:spacing w:after="120"/>
+      </w:pPr>
+      <w:r>
+        <w:rPr>
+          <w:b/>
+        </w:rPr>
+        <w:t>2.3 Proponga cuatro medidas de capacitación para empleados:</w:t>
+      </w:r>
+    </w:p>
+    <w:p>
+      <w:pPr>
+        <w:spacing w:after="120"/>
+        <w:jc w:val="both"/>
+      </w:pPr>
+      <w:r>
+        <w:t>1. Capacitar al comité electoral en manejo de datos sensibles y en no consultar resultados individuales sin que quede registrado el motivo.</w:t>
+      </w:r>
+    </w:p>
+    <w:p>
+      <w:pPr>
+        <w:spacing w:after="120"/>
+        <w:jc w:val="both"/>
+      </w:pPr>
+      <w:r>
+        <w:t>2. Capacitación en phishing dirigida a votantes, para que reconozcan un correo falso de “token de votación”.</w:t>
+      </w:r>
+    </w:p>
+    <w:p>
+      <w:pPr>
+        <w:spacing w:after="120"/>
+        <w:jc w:val="both"/>
+      </w:pPr>
+      <w:r>
+        <w:t>3. Capacitación técnica al equipo de desarrollo sobre buenas prácticas de seguridad (OWASP y NIST).</w:t>
+      </w:r>
+    </w:p>
+    <w:p>
+      <w:pPr>
+        <w:spacing w:after="120"/>
+        <w:jc w:val="both"/>
+      </w:pPr>
+      <w:r>
+        <w:t>4. Simulacros internos de respuesta a incidentes para el equipo técnico del colegio, antes de que ocurra uno real.</w:t>
+      </w:r>
+    </w:p>
+    <w:p>
+      <w:pPr>
+        <w:spacing w:after="120"/>
+      </w:pPr>
+      <w:r>
+        <w:rPr>
+          <w:b w:val="0"/>
+        </w:rPr>
+      </w:r>
+    </w:p>
+    <w:p>
+      <w:pPr>
+        <w:spacing w:after="120"/>
       </w:pPr>
       <w:r>
         <w:rPr>
@@ -742,73 +576,55 @@
     </w:p>
     <w:p>
       <w:pPr>
-        <w:spacing w:line="360" w:lineRule="auto" w:after="0" w:before="0"/>
+        <w:spacing w:after="120"/>
       </w:pPr>
       <w:r>
         <w:rPr>
           <w:b/>
         </w:rPr>
-        <w:t>3.1 Cuatro eventos de seguridad a monitorear y por qué:</w:t>
+        <w:t>3.1 ¿Qué eventos de seguridad deberían monitorearse? Cite y explique 4:</w:t>
       </w:r>
     </w:p>
     <w:p>
       <w:pPr>
-        <w:spacing w:line="360" w:lineRule="auto" w:after="120"/>
+        <w:spacing w:after="120"/>
         <w:jc w:val="both"/>
       </w:pPr>
       <w:r>
         <w:rPr>
-          <w:b w:val="0"/>
+          <w:b/>
         </w:rPr>
-        <w:t xml:space="preserve">1. </w:t>
+        <w:t xml:space="preserve">1. Intentos repetidos de voto con tokens secuenciales o muy similares: </w:t>
       </w:r>
+      <w:r>
+        <w:t>es señal directa de que alguien está prediciendo tokens a partir de cédulas.</w:t>
+      </w:r>
+    </w:p>
+    <w:p>
+      <w:pPr>
+        <w:spacing w:after="120"/>
+        <w:jc w:val="both"/>
+      </w:pPr>
       <w:r>
         <w:rPr>
           <w:b/>
         </w:rPr>
-        <w:t xml:space="preserve">Intentos repetidos de voto con tokens secuenciales o muy similares — </w:t>
+        <w:t xml:space="preserve">2. Accesos al panel de administración fuera de la ventana de elección o desde ubicaciones inusuales: </w:t>
       </w:r>
       <w:r>
-        <w:t>señal directa de que alguien está prediciendo tokens a partir de cédulas.</w:t>
+        <w:t>el panel solo debería usarse durante la votación o la auditoría.</w:t>
       </w:r>
     </w:p>
     <w:p>
       <w:pPr>
-        <w:spacing w:line="360" w:lineRule="auto" w:after="120"/>
+        <w:spacing w:after="120"/>
         <w:jc w:val="both"/>
       </w:pPr>
       <w:r>
         <w:rPr>
-          <w:b w:val="0"/>
-        </w:rPr>
-        <w:t xml:space="preserve">2. </w:t>
-      </w:r>
-      <w:r>
-        <w:rPr>
           <w:b/>
         </w:rPr>
-        <w:t xml:space="preserve">Accesos al panel de administración fuera de la ventana de elección o desde ubicaciones inusuales — </w:t>
-      </w:r>
-      <w:r>
-        <w:t>el panel solo debería usarse durante la votación/auditoría.</w:t>
-      </w:r>
-    </w:p>
-    <w:p>
-      <w:pPr>
-        <w:spacing w:line="360" w:lineRule="auto" w:after="120"/>
-        <w:jc w:val="both"/>
-      </w:pPr>
-      <w:r>
-        <w:rPr>
-          <w:b w:val="0"/>
-        </w:rPr>
-        <w:t xml:space="preserve">3. </w:t>
-      </w:r>
-      <w:r>
-        <w:rPr>
-          <w:b/>
-        </w:rPr>
-        <w:t xml:space="preserve">Consultas inusualmente frecuentes a la tabla de votos por un mismo admin — </w:t>
+        <w:t xml:space="preserve">3. Consultas inusualmente frecuentes a la tabla de votos por un mismo administrador: </w:t>
       </w:r>
       <w:r>
         <w:t>podría ser un insider revisando votos individuales uno por uno.</w:t>
@@ -816,123 +632,22 @@
     </w:p>
     <w:p>
       <w:pPr>
-        <w:spacing w:line="360" w:lineRule="auto" w:after="120"/>
+        <w:spacing w:after="120"/>
         <w:jc w:val="both"/>
-      </w:pPr>
-      <w:r>
-        <w:rPr>
-          <w:b w:val="0"/>
-        </w:rPr>
-        <w:t xml:space="preserve">4. </w:t>
-      </w:r>
-      <w:r>
-        <w:rPr>
-          <w:b/>
-        </w:rPr>
-        <w:t xml:space="preserve">Picos de errores o reenvíos en el servicio de correo — </w:t>
-      </w:r>
-      <w:r>
-        <w:t>podría indicar interceptación o reenvío masivo de tokens por un atacante.</w:t>
-      </w:r>
-    </w:p>
-    <w:p>
-      <w:pPr>
-        <w:spacing w:line="360" w:lineRule="auto" w:after="0" w:before="0"/>
       </w:pPr>
       <w:r>
         <w:rPr>
           <w:b/>
         </w:rPr>
-        <w:t>3.2 Cuatro herramientas o mecanismos y por qué se elige cada uno:</w:t>
+        <w:t xml:space="preserve">4. Picos de errores o reenvíos en el servicio de correo: </w:t>
+      </w:r>
+      <w:r>
+        <w:t>podrían indicar interceptación o reenvío masivo de tokens por parte de un atacante.</w:t>
       </w:r>
     </w:p>
     <w:p>
       <w:pPr>
-        <w:spacing w:line="360" w:lineRule="auto" w:after="120"/>
-        <w:jc w:val="both"/>
-      </w:pPr>
-      <w:r>
-        <w:rPr>
-          <w:b w:val="0"/>
-        </w:rPr>
-        <w:t xml:space="preserve">1. </w:t>
-      </w:r>
-      <w:r>
-        <w:rPr>
-          <w:b/>
-        </w:rPr>
-        <w:t xml:space="preserve">Logging centralizado con alertas (SIEM básico) — </w:t>
-      </w:r>
-      <w:r>
-        <w:t>correlaciona eventos del panel, la base de datos y el correo en un solo lugar.</w:t>
-      </w:r>
-    </w:p>
-    <w:p>
-      <w:pPr>
-        <w:spacing w:line="360" w:lineRule="auto" w:after="120"/>
-        <w:jc w:val="both"/>
-      </w:pPr>
-      <w:r>
-        <w:rPr>
-          <w:b w:val="0"/>
-        </w:rPr>
-        <w:t xml:space="preserve">2. </w:t>
-      </w:r>
-      <w:r>
-        <w:rPr>
-          <w:b/>
-        </w:rPr>
-        <w:t xml:space="preserve">Rate limiting / detección de anomalías en el endpoint de votación — </w:t>
-      </w:r>
-      <w:r>
-        <w:t>el ataque de predicción de tokens necesita probar muchos valores rápido; limitar la tasa lo hace visible.</w:t>
-      </w:r>
-    </w:p>
-    <w:p>
-      <w:pPr>
-        <w:spacing w:line="360" w:lineRule="auto" w:after="120"/>
-        <w:jc w:val="both"/>
-      </w:pPr>
-      <w:r>
-        <w:rPr>
-          <w:b w:val="0"/>
-        </w:rPr>
-        <w:t xml:space="preserve">3. </w:t>
-      </w:r>
-      <w:r>
-        <w:rPr>
-          <w:b/>
-        </w:rPr>
-        <w:t xml:space="preserve">Monitoreo de integridad de la base de datos electoral — </w:t>
-      </w:r>
-      <w:r>
-        <w:t>detecta si un resultado fue modificado fuera del flujo normal de votación.</w:t>
-      </w:r>
-    </w:p>
-    <w:p>
-      <w:pPr>
-        <w:spacing w:line="360" w:lineRule="auto" w:after="120"/>
-        <w:jc w:val="both"/>
-      </w:pPr>
-      <w:r>
-        <w:rPr>
-          <w:b w:val="0"/>
-        </w:rPr>
-        <w:t xml:space="preserve">4. </w:t>
-      </w:r>
-      <w:r>
-        <w:rPr>
-          <w:b/>
-        </w:rPr>
-        <w:t xml:space="preserve">Auditoría de sesiones del panel — </w:t>
-      </w:r>
-      <w:r>
-        <w:t>detectar la misma cookie usada desde dos ubicaciones a la vez revela directamente un robo de sesión.</w:t>
-      </w:r>
-    </w:p>
-    <w:p>
-      <w:pPr>
-        <w:spacing w:line="360" w:lineRule="auto" w:after="0" w:before="0"/>
+        <w:spacing w:after="120"/>
       </w:pPr>
       <w:r>
         <w:rPr>
@@ -942,7 +657,88 @@
     </w:p>
     <w:p>
       <w:pPr>
-        <w:spacing w:line="360" w:lineRule="auto" w:after="0" w:before="0"/>
+        <w:spacing w:after="120"/>
+      </w:pPr>
+      <w:r>
+        <w:rPr>
+          <w:b/>
+        </w:rPr>
+        <w:t>3.2 ¿Qué herramientas o mecanismos podrían utilizarse para detectar incidentes? Cite 4 y explique el porqué de cada elección:</w:t>
+      </w:r>
+    </w:p>
+    <w:p>
+      <w:pPr>
+        <w:spacing w:after="120"/>
+        <w:jc w:val="both"/>
+      </w:pPr>
+      <w:r>
+        <w:rPr>
+          <w:b/>
+        </w:rPr>
+        <w:t xml:space="preserve">1. Logging centralizado con alertas (SIEM básico): </w:t>
+      </w:r>
+      <w:r>
+        <w:t>correlaciona eventos del panel, la base de datos y el correo en un solo lugar.</w:t>
+      </w:r>
+    </w:p>
+    <w:p>
+      <w:pPr>
+        <w:spacing w:after="120"/>
+        <w:jc w:val="both"/>
+      </w:pPr>
+      <w:r>
+        <w:rPr>
+          <w:b/>
+        </w:rPr>
+        <w:t xml:space="preserve">2. Rate limiting o detección de anomalías en el endpoint de votación: </w:t>
+      </w:r>
+      <w:r>
+        <w:t>el ataque de predicción de tokens necesita probar muchos valores rápido, y limitar la tasa lo hace visible.</w:t>
+      </w:r>
+    </w:p>
+    <w:p>
+      <w:pPr>
+        <w:spacing w:after="120"/>
+        <w:jc w:val="both"/>
+      </w:pPr>
+      <w:r>
+        <w:rPr>
+          <w:b/>
+        </w:rPr>
+        <w:t xml:space="preserve">3. Monitoreo de integridad de la base de datos electoral: </w:t>
+      </w:r>
+      <w:r>
+        <w:t>detecta si un resultado fue modificado fuera del flujo normal de votación.</w:t>
+      </w:r>
+    </w:p>
+    <w:p>
+      <w:pPr>
+        <w:spacing w:after="120"/>
+        <w:jc w:val="both"/>
+      </w:pPr>
+      <w:r>
+        <w:rPr>
+          <w:b/>
+        </w:rPr>
+        <w:t xml:space="preserve">4. Auditoría de sesiones del panel: </w:t>
+      </w:r>
+      <w:r>
+        <w:t>detectar la misma cookie usada desde dos ubicaciones a la vez revela directamente un robo de sesión.</w:t>
+      </w:r>
+    </w:p>
+    <w:p>
+      <w:pPr>
+        <w:spacing w:after="120"/>
+      </w:pPr>
+      <w:r>
+        <w:rPr>
+          <w:b w:val="0"/>
+        </w:rPr>
+      </w:r>
+    </w:p>
+    <w:p>
+      <w:pPr>
+        <w:spacing w:after="120"/>
       </w:pPr>
       <w:r>
         <w:rPr>
@@ -953,42 +749,36 @@
     </w:p>
     <w:p>
       <w:pPr>
-        <w:spacing w:line="360" w:lineRule="auto" w:after="0" w:before="0"/>
+        <w:spacing w:after="120"/>
       </w:pPr>
       <w:r>
         <w:rPr>
           <w:b/>
         </w:rPr>
-        <w:t>Escenario: un atacante obtuvo acceso a la cuenta de un empleado (del comité electoral, con acceso al panel).</w:t>
+        <w:t>Se detectó que un atacante obtuvo acceso a la cuenta de un empleado.</w:t>
       </w:r>
     </w:p>
     <w:p>
       <w:pPr>
-        <w:spacing w:line="360" w:lineRule="auto" w:after="0" w:before="0"/>
+        <w:spacing w:after="120"/>
       </w:pPr>
       <w:r>
         <w:rPr>
           <w:b/>
         </w:rPr>
-        <w:t>4.1 Cuatro acciones inmediatas y por qué:</w:t>
+        <w:t>4.1 ¿Qué acciones inmediatas deberían tomarse? Cite y explique 4:</w:t>
       </w:r>
     </w:p>
     <w:p>
       <w:pPr>
-        <w:spacing w:line="360" w:lineRule="auto" w:after="120"/>
+        <w:spacing w:after="120"/>
         <w:jc w:val="both"/>
       </w:pPr>
       <w:r>
         <w:rPr>
-          <w:b w:val="0"/>
-        </w:rPr>
-        <w:t xml:space="preserve">1. </w:t>
-      </w:r>
-      <w:r>
-        <w:rPr>
           <w:b/>
         </w:rPr>
-        <w:t xml:space="preserve">Revocar la sesión comprometida y forzar cambio de credenciales — </w:t>
+        <w:t xml:space="preserve">1. Revocar la sesión comprometida y forzar el cambio de credenciales: </w:t>
       </w:r>
       <w:r>
         <w:t>corta el acceso activo del atacante de inmediato.</w:t>
@@ -996,20 +786,14 @@
     </w:p>
     <w:p>
       <w:pPr>
-        <w:spacing w:line="360" w:lineRule="auto" w:after="120"/>
+        <w:spacing w:after="120"/>
         <w:jc w:val="both"/>
       </w:pPr>
       <w:r>
         <w:rPr>
-          <w:b w:val="0"/>
-        </w:rPr>
-        <w:t xml:space="preserve">2. </w:t>
-      </w:r>
-      <w:r>
-        <w:rPr>
           <w:b/>
         </w:rPr>
-        <w:t xml:space="preserve">Poner el panel de administración en modo solo lectura temporalmente — </w:t>
+        <w:t xml:space="preserve">2. Poner el panel de administración en modo de solo lectura temporalmente: </w:t>
       </w:r>
       <w:r>
         <w:t>evita que el atacante altere resultados mientras dura la investigación.</w:t>
@@ -1017,20 +801,14 @@
     </w:p>
     <w:p>
       <w:pPr>
-        <w:spacing w:line="360" w:lineRule="auto" w:after="120"/>
+        <w:spacing w:after="120"/>
         <w:jc w:val="both"/>
       </w:pPr>
       <w:r>
         <w:rPr>
-          <w:b w:val="0"/>
-        </w:rPr>
-        <w:t xml:space="preserve">3. </w:t>
-      </w:r>
-      <w:r>
-        <w:rPr>
           <w:b/>
         </w:rPr>
-        <w:t xml:space="preserve">Revisar los logs de esa cuenta — </w:t>
+        <w:t xml:space="preserve">3. Revisar los registros de esa cuenta: </w:t>
       </w:r>
       <w:r>
         <w:t>permite saber si solo hubo lectura (grave para el secreto del voto) o también alteración de resultados (grave para la integridad de la elección).</w:t>
@@ -1038,20 +816,14 @@
     </w:p>
     <w:p>
       <w:pPr>
-        <w:spacing w:line="360" w:lineRule="auto" w:after="120"/>
+        <w:spacing w:after="120"/>
         <w:jc w:val="both"/>
       </w:pPr>
       <w:r>
         <w:rPr>
-          <w:b w:val="0"/>
-        </w:rPr>
-        <w:t xml:space="preserve">4. </w:t>
-      </w:r>
-      <w:r>
-        <w:rPr>
           <w:b/>
         </w:rPr>
-        <w:t xml:space="preserve">Notificar al equipo técnico/seguridad y activar el plan de respuesta — </w:t>
+        <w:t xml:space="preserve">4. Notificar al equipo técnico y de seguridad, y activar el plan de respuesta: </w:t>
       </w:r>
       <w:r>
         <w:t>convierte el hallazgo de una persona en una gestión formal del incidente.</w:t>
@@ -1059,30 +831,7 @@
     </w:p>
     <w:p>
       <w:pPr>
-        <w:spacing w:line="360" w:lineRule="auto" w:after="0" w:before="0"/>
-      </w:pPr>
-      <w:r>
-        <w:rPr>
-          <w:b/>
-        </w:rPr>
-        <w:t>4.2 Cómo comunicar el incidente internamente (quién hace qué):</w:t>
-      </w:r>
-    </w:p>
-    <w:p>
-      <w:pPr>
-        <w:spacing w:line="360" w:lineRule="auto" w:after="0" w:before="0"/>
-        <w:jc w:val="both"/>
-      </w:pPr>
-      <w:r>
-        <w:rPr>
-          <w:b w:val="0"/>
-        </w:rPr>
-        <w:t>Quien detecta la anomalía avisa de inmediato al responsable técnico, sin intentar resolverlo por su cuenta. El equipo técnico/TI confirma si es un incidente real y, de serlo, escala a la dirección del colegio profesional. La dirección decide si corresponde notificar a los colegiados o a un ente regulador. Se designa un solo vocero para consolidar la comunicación mientras dura la investigación, evitando versiones contradictorias.</w:t>
-      </w:r>
-    </w:p>
-    <w:p>
-      <w:pPr>
-        <w:spacing w:line="360" w:lineRule="auto" w:after="0" w:before="0"/>
+        <w:spacing w:after="120"/>
       </w:pPr>
       <w:r>
         <w:rPr>
@@ -1092,7 +841,40 @@
     </w:p>
     <w:p>
       <w:pPr>
-        <w:spacing w:line="360" w:lineRule="auto" w:after="0" w:before="0"/>
+        <w:spacing w:after="120"/>
+      </w:pPr>
+      <w:r>
+        <w:rPr>
+          <w:b/>
+        </w:rPr>
+        <w:t>4.2 ¿Cómo debería comunicarse el incidente dentro de la organización? Indique quién realiza qué comunicación:</w:t>
+      </w:r>
+    </w:p>
+    <w:p>
+      <w:pPr>
+        <w:spacing w:after="120"/>
+        <w:jc w:val="both"/>
+      </w:pPr>
+      <w:r>
+        <w:rPr>
+          <w:b w:val="0"/>
+        </w:rPr>
+        <w:t>Quien detecta la anomalía avisa de inmediato al responsable técnico, sin intentar resolverlo por su cuenta. El equipo técnico confirma si es un incidente real y, de serlo, escala a la dirección del colegio profesional. La dirección decide si corresponde notificar a los colegiados o a un ente regulador. Se designa un solo vocero para consolidar la comunicación mientras dura la investigación, evitando versiones contradictorias.</w:t>
+      </w:r>
+    </w:p>
+    <w:p>
+      <w:pPr>
+        <w:spacing w:after="120"/>
+      </w:pPr>
+      <w:r>
+        <w:rPr>
+          <w:b w:val="0"/>
+        </w:rPr>
+      </w:r>
+    </w:p>
+    <w:p>
+      <w:pPr>
+        <w:spacing w:after="120"/>
       </w:pPr>
       <w:r>
         <w:rPr>
@@ -1103,52 +885,40 @@
     </w:p>
     <w:p>
       <w:pPr>
-        <w:spacing w:line="360" w:lineRule="auto" w:after="0" w:before="0"/>
+        <w:spacing w:after="120"/>
       </w:pPr>
       <w:r>
         <w:rPr>
           <w:b/>
         </w:rPr>
-        <w:t>5.1 Cuatro acciones para restaurar los sistemas y por qué:</w:t>
+        <w:t>5.1 ¿Qué acciones permitirían restaurar los sistemas? Cite y explique 4:</w:t>
       </w:r>
     </w:p>
     <w:p>
       <w:pPr>
-        <w:spacing w:line="360" w:lineRule="auto" w:after="120"/>
+        <w:spacing w:after="120"/>
         <w:jc w:val="both"/>
       </w:pPr>
       <w:r>
         <w:rPr>
-          <w:b w:val="0"/>
+          <w:b/>
         </w:rPr>
-        <w:t xml:space="preserve">1. </w:t>
+        <w:t xml:space="preserve">1. Restaurar la cuenta comprometida con credenciales nuevas y MFA obligatorio: </w:t>
       </w:r>
+      <w:r>
+        <w:t>evita que el mismo atacante vuelva a entrar apenas se reabra el acceso.</w:t>
+      </w:r>
+    </w:p>
+    <w:p>
+      <w:pPr>
+        <w:spacing w:after="120"/>
+        <w:jc w:val="both"/>
+      </w:pPr>
       <w:r>
         <w:rPr>
           <w:b/>
         </w:rPr>
-        <w:t xml:space="preserve">Restaurar la cuenta comprometida con credenciales nuevas y MFA obligatorio — </w:t>
-      </w:r>
-      <w:r>
-        <w:t>evita que el mismo atacante reingrese apenas se reabra el acceso.</w:t>
-      </w:r>
-    </w:p>
-    <w:p>
-      <w:pPr>
-        <w:spacing w:line="360" w:lineRule="auto" w:after="120"/>
-        <w:jc w:val="both"/>
-      </w:pPr>
-      <w:r>
-        <w:rPr>
-          <w:b w:val="0"/>
-        </w:rPr>
-        <w:t xml:space="preserve">2. </w:t>
-      </w:r>
-      <w:r>
-        <w:rPr>
-          <w:b/>
-        </w:rPr>
-        <w:t xml:space="preserve">Verificar la integridad de los votos ya emitidos contra un respaldo previo al incidente — </w:t>
+        <w:t xml:space="preserve">2. Verificar la integridad de los votos ya emitidos contra un respaldo previo al incidente: </w:t>
       </w:r>
       <w:r>
         <w:t>confirma si los resultados fueron alterados antes de dar la elección por válida.</w:t>
@@ -1156,20 +926,14 @@
     </w:p>
     <w:p>
       <w:pPr>
-        <w:spacing w:line="360" w:lineRule="auto" w:after="120"/>
+        <w:spacing w:after="120"/>
         <w:jc w:val="both"/>
       </w:pPr>
       <w:r>
         <w:rPr>
-          <w:b w:val="0"/>
-        </w:rPr>
-        <w:t xml:space="preserve">3. </w:t>
-      </w:r>
-      <w:r>
-        <w:rPr>
           <w:b/>
         </w:rPr>
-        <w:t xml:space="preserve">Reemitir tokens a los votantes afectados — </w:t>
+        <w:t xml:space="preserve">3. Reemitir tokens a los votantes afectados: </w:t>
       </w:r>
       <w:r>
         <w:t>preserva la validez de sus votos sin invalidar toda la elección.</w:t>
@@ -1177,123 +941,22 @@
     </w:p>
     <w:p>
       <w:pPr>
-        <w:spacing w:line="360" w:lineRule="auto" w:after="120"/>
+        <w:spacing w:after="120"/>
         <w:jc w:val="both"/>
-      </w:pPr>
-      <w:r>
-        <w:rPr>
-          <w:b w:val="0"/>
-        </w:rPr>
-        <w:t xml:space="preserve">4. </w:t>
-      </w:r>
-      <w:r>
-        <w:rPr>
-          <w:b/>
-        </w:rPr>
-        <w:t xml:space="preserve">Restaurar desde el último backup íntegro conocido, si se confirma manipulación — </w:t>
-      </w:r>
-      <w:r>
-        <w:t>se vuelve a un estado verificado en vez de confiar en el estado actual.</w:t>
-      </w:r>
-    </w:p>
-    <w:p>
-      <w:pPr>
-        <w:spacing w:line="360" w:lineRule="auto" w:after="0" w:before="0"/>
       </w:pPr>
       <w:r>
         <w:rPr>
           <w:b/>
         </w:rPr>
-        <w:t>5.2 Cuatro mejoras de proceso después del incidente y por qué:</w:t>
+        <w:t xml:space="preserve">4. Restaurar desde el último respaldo íntegro conocido, si se confirma manipulación: </w:t>
+      </w:r>
+      <w:r>
+        <w:t>permite volver a un estado verificado en vez de confiar en el estado actual.</w:t>
       </w:r>
     </w:p>
     <w:p>
       <w:pPr>
-        <w:spacing w:line="360" w:lineRule="auto" w:after="120"/>
-        <w:jc w:val="both"/>
-      </w:pPr>
-      <w:r>
-        <w:rPr>
-          <w:b w:val="0"/>
-        </w:rPr>
-        <w:t xml:space="preserve">1. </w:t>
-      </w:r>
-      <w:r>
-        <w:rPr>
-          <w:b/>
-        </w:rPr>
-        <w:t xml:space="preserve">MFA obligatorio en todas las cuentas del panel — </w:t>
-      </w:r>
-      <w:r>
-        <w:t>cierra permanentemente la puerta que se usó esta vez.</w:t>
-      </w:r>
-    </w:p>
-    <w:p>
-      <w:pPr>
-        <w:spacing w:line="360" w:lineRule="auto" w:after="120"/>
-        <w:jc w:val="both"/>
-      </w:pPr>
-      <w:r>
-        <w:rPr>
-          <w:b w:val="0"/>
-        </w:rPr>
-        <w:t xml:space="preserve">2. </w:t>
-      </w:r>
-      <w:r>
-        <w:rPr>
-          <w:b/>
-        </w:rPr>
-        <w:t xml:space="preserve">Adoptar el rediseño de tokens (HMAC + salt) y la separación de tablas de Tarea 2 — </w:t>
-      </w:r>
-      <w:r>
-        <w:t>convierte una lección aprendida en un cambio de diseño real.</w:t>
-      </w:r>
-    </w:p>
-    <w:p>
-      <w:pPr>
-        <w:spacing w:line="360" w:lineRule="auto" w:after="120"/>
-        <w:jc w:val="both"/>
-      </w:pPr>
-      <w:r>
-        <w:rPr>
-          <w:b w:val="0"/>
-        </w:rPr>
-        <w:t xml:space="preserve">3. </w:t>
-      </w:r>
-      <w:r>
-        <w:rPr>
-          <w:b/>
-        </w:rPr>
-        <w:t xml:space="preserve">Revisiones periódicas de logs de auditoría, no solo reactivas — </w:t>
-      </w:r>
-      <w:r>
-        <w:t>pasa de detectar por accidente a detectar por proceso.</w:t>
-      </w:r>
-    </w:p>
-    <w:p>
-      <w:pPr>
-        <w:spacing w:line="360" w:lineRule="auto" w:after="120"/>
-        <w:jc w:val="both"/>
-      </w:pPr>
-      <w:r>
-        <w:rPr>
-          <w:b w:val="0"/>
-        </w:rPr>
-        <w:t xml:space="preserve">4. </w:t>
-      </w:r>
-      <w:r>
-        <w:rPr>
-          <w:b/>
-        </w:rPr>
-        <w:t xml:space="preserve">Post-mortem sin culpa (blameless) que actualice el plan de respuesta — </w:t>
-      </w:r>
-      <w:r>
-        <w:t>mejora continua real del proceso.</w:t>
-      </w:r>
-    </w:p>
-    <w:p>
-      <w:pPr>
-        <w:spacing w:line="360" w:lineRule="auto" w:after="0" w:before="0"/>
+        <w:spacing w:after="120"/>
       </w:pPr>
       <w:r>
         <w:rPr>
@@ -1303,27 +966,385 @@
     </w:p>
     <w:p>
       <w:pPr>
-        <w:spacing w:line="360" w:lineRule="auto" w:after="0" w:before="0"/>
+        <w:spacing w:after="120"/>
       </w:pPr>
       <w:r>
         <w:rPr>
           <w:b/>
         </w:rPr>
-        <w:t>Cómo se conecta con lo que ya vimos</w:t>
+        <w:t>5.2 ¿Qué mejoras de procesos implementaría después del incidente? Cite y explique 4:</w:t>
       </w:r>
     </w:p>
     <w:p>
       <w:pPr>
-        <w:spacing w:line="360" w:lineRule="auto" w:after="0" w:before="0"/>
+        <w:spacing w:after="120"/>
         <w:jc w:val="both"/>
+      </w:pPr>
+      <w:r>
+        <w:rPr>
+          <w:b/>
+        </w:rPr>
+        <w:t xml:space="preserve">1. MFA obligatorio en todas las cuentas del panel: </w:t>
+      </w:r>
+      <w:r>
+        <w:t>cierra permanentemente la puerta que se usó esta vez.</w:t>
+      </w:r>
+    </w:p>
+    <w:p>
+      <w:pPr>
+        <w:spacing w:after="120"/>
+        <w:jc w:val="both"/>
+      </w:pPr>
+      <w:r>
+        <w:rPr>
+          <w:b/>
+        </w:rPr>
+        <w:t xml:space="preserve">2. Adoptar el rediseño de los tokens (HMAC + salt) y la separación de tablas ya planteados: </w:t>
+      </w:r>
+      <w:r>
+        <w:t>convierte una lección aprendida en un cambio de diseño real.</w:t>
+      </w:r>
+    </w:p>
+    <w:p>
+      <w:pPr>
+        <w:spacing w:after="120"/>
+        <w:jc w:val="both"/>
+      </w:pPr>
+      <w:r>
+        <w:rPr>
+          <w:b/>
+        </w:rPr>
+        <w:t xml:space="preserve">3. Revisiones periódicas de los registros de auditoría, no solo reactivas ante incidentes: </w:t>
+      </w:r>
+      <w:r>
+        <w:t>pasa de detectar por accidente a detectar por proceso.</w:t>
+      </w:r>
+    </w:p>
+    <w:p>
+      <w:pPr>
+        <w:spacing w:after="120"/>
+        <w:jc w:val="both"/>
+      </w:pPr>
+      <w:r>
+        <w:rPr>
+          <w:b/>
+        </w:rPr>
+        <w:t xml:space="preserve">4. Un post-mortem sin culpa que actualice el plan de respuesta: </w:t>
+      </w:r>
+      <w:r>
+        <w:t>asegura una mejora continua real del proceso.</w:t>
+      </w:r>
+    </w:p>
+    <w:p>
+      <w:pPr>
+        <w:spacing w:after="120"/>
       </w:pPr>
       <w:r>
         <w:rPr>
           <w:b w:val="0"/>
         </w:rPr>
-        <w:t>Este no es un ejercicio aislado: es el mismo caso VoteOnline de la Tarea 2, reorganizado bajo las funciones del NIST CSF. El Threat Modeling identificó qué podía salir mal y cómo mitigarlo desde el diseño; el NIST CSF organiza esas mismas ideas en un ciclo continuo — casi todas las mitigaciones de diseño de Tarea 2 (separar tablas, MFA, tokens HMAC+salt, cookies seguras) reaparecen acá bajo PROTECT, porque son la misma solución vista desde dos frameworks distintos.</w:t>
       </w:r>
     </w:p>
+    <w:p>
+      <w:pPr>
+        <w:spacing w:after="120"/>
+      </w:pPr>
+      <w:r>
+        <w:rPr>
+          <w:b/>
+        </w:rPr>
+        <w:t>Rúbrica de evaluación</w:t>
+      </w:r>
+    </w:p>
+    <w:tbl>
+      <w:tblPr>
+        <w:tblStyle w:val="TableGrid"/>
+        <w:tblW w:type="auto" w:w="0"/>
+        <w:tblLook w:firstColumn="1" w:firstRow="1" w:lastColumn="0" w:lastRow="0" w:noHBand="0" w:noVBand="1" w:val="04A0"/>
+      </w:tblPr>
+      <w:tblGrid>
+        <w:gridCol w:w="1728"/>
+        <w:gridCol w:w="1728"/>
+        <w:gridCol w:w="1728"/>
+        <w:gridCol w:w="1728"/>
+        <w:gridCol w:w="1728"/>
+      </w:tblGrid>
+      <w:tr>
+        <w:tc>
+          <w:tcPr>
+            <w:tcW w:type="dxa" w:w="1728"/>
+          </w:tcPr>
+          <w:p>
+            <w:r>
+              <w:rPr>
+                <w:b/>
+              </w:rPr>
+              <w:t>Criterio</w:t>
+            </w:r>
+          </w:p>
+        </w:tc>
+        <w:tc>
+          <w:tcPr>
+            <w:tcW w:type="dxa" w:w="1728"/>
+          </w:tcPr>
+          <w:p>
+            <w:r>
+              <w:rPr>
+                <w:b/>
+              </w:rPr>
+              <w:t>Excelente (100%)</w:t>
+            </w:r>
+          </w:p>
+        </w:tc>
+        <w:tc>
+          <w:tcPr>
+            <w:tcW w:type="dxa" w:w="1728"/>
+          </w:tcPr>
+          <w:p>
+            <w:r>
+              <w:rPr>
+                <w:b/>
+              </w:rPr>
+              <w:t>Aceptable (70%)</w:t>
+            </w:r>
+          </w:p>
+        </w:tc>
+        <w:tc>
+          <w:tcPr>
+            <w:tcW w:type="dxa" w:w="1728"/>
+          </w:tcPr>
+          <w:p>
+            <w:r>
+              <w:rPr>
+                <w:b/>
+              </w:rPr>
+              <w:t>Insuficiente (40%)</w:t>
+            </w:r>
+          </w:p>
+        </w:tc>
+        <w:tc>
+          <w:tcPr>
+            <w:tcW w:type="dxa" w:w="1728"/>
+          </w:tcPr>
+          <w:p>
+            <w:r>
+              <w:rPr>
+                <w:b/>
+              </w:rPr>
+              <w:t>Puntaje</w:t>
+            </w:r>
+          </w:p>
+        </w:tc>
+      </w:tr>
+      <w:tr>
+        <w:tc>
+          <w:tcPr>
+            <w:tcW w:type="dxa" w:w="1728"/>
+          </w:tcPr>
+          <w:p>
+            <w:r>
+              <w:t>1.1 Identificación de Activos Críticos</w:t>
+            </w:r>
+          </w:p>
+        </w:tc>
+        <w:tc>
+          <w:tcPr>
+            <w:tcW w:type="dxa" w:w="1728"/>
+          </w:tcPr>
+          <w:p>
+            <w:r>
+              <w:t>Enumera correctamente 4 activos críticos alineados y relevantes al contexto de la empresa.</w:t>
+            </w:r>
+          </w:p>
+        </w:tc>
+        <w:tc>
+          <w:tcPr>
+            <w:tcW w:type="dxa" w:w="1728"/>
+          </w:tcPr>
+          <w:p>
+            <w:r>
+              <w:t>Enumera entre 2 y 3 activos válidos, o los 4 con alineación parcial al escenario.</w:t>
+            </w:r>
+          </w:p>
+        </w:tc>
+        <w:tc>
+          <w:tcPr>
+            <w:tcW w:type="dxa" w:w="1728"/>
+          </w:tcPr>
+          <w:p>
+            <w:r>
+              <w:t>Enumera solo 1 activo relevante o presenta activos genéricos/incorrectos.</w:t>
+            </w:r>
+          </w:p>
+        </w:tc>
+        <w:tc>
+          <w:tcPr>
+            <w:tcW w:type="dxa" w:w="1728"/>
+          </w:tcPr>
+          <w:p>
+            <w:r>
+              <w:t>15 pts</w:t>
+            </w:r>
+          </w:p>
+        </w:tc>
+      </w:tr>
+      <w:tr>
+        <w:tc>
+          <w:tcPr>
+            <w:tcW w:type="dxa" w:w="1728"/>
+          </w:tcPr>
+          <w:p>
+            <w:r>
+              <w:t>1.2 Clasificación de Datos de Clientes</w:t>
+            </w:r>
+          </w:p>
+        </w:tc>
+        <w:tc>
+          <w:tcPr>
+            <w:tcW w:type="dxa" w:w="1728"/>
+          </w:tcPr>
+          <w:p>
+            <w:r>
+              <w:t>Identifica claramente los tipos de datos de clientes que deben protegerse en el escenario.</w:t>
+            </w:r>
+          </w:p>
+        </w:tc>
+        <w:tc>
+          <w:tcPr>
+            <w:tcW w:type="dxa" w:w="1728"/>
+          </w:tcPr>
+          <w:p>
+            <w:r>
+              <w:t>Identifica datos de clientes de manera general o incompleta sin detallar la categoría.</w:t>
+            </w:r>
+          </w:p>
+        </w:tc>
+        <w:tc>
+          <w:tcPr>
+            <w:tcW w:type="dxa" w:w="1728"/>
+          </w:tcPr>
+          <w:p>
+            <w:r>
+              <w:t>Menciona datos de forma vaga o irrelevante para la protección del negocio.</w:t>
+            </w:r>
+          </w:p>
+        </w:tc>
+        <w:tc>
+          <w:tcPr>
+            <w:tcW w:type="dxa" w:w="1728"/>
+          </w:tcPr>
+          <w:p>
+            <w:r>
+              <w:t>15 pts</w:t>
+            </w:r>
+          </w:p>
+        </w:tc>
+      </w:tr>
+      <w:tr>
+        <w:tc>
+          <w:tcPr>
+            <w:tcW w:type="dxa" w:w="1728"/>
+          </w:tcPr>
+          <w:p>
+            <w:r>
+              <w:t>1.3 Análisis y Justificación de Riesgos</w:t>
+            </w:r>
+          </w:p>
+        </w:tc>
+        <w:tc>
+          <w:tcPr>
+            <w:tcW w:type="dxa" w:w="1728"/>
+          </w:tcPr>
+          <w:p>
+            <w:r>
+              <w:t>Identifica 4 riesgos pertinentes y justifica de manera técnica y clara por qué representan un riesgo real.</w:t>
+            </w:r>
+          </w:p>
+        </w:tc>
+        <w:tc>
+          <w:tcPr>
+            <w:tcW w:type="dxa" w:w="1728"/>
+          </w:tcPr>
+          <w:p>
+            <w:r>
+              <w:t>Identifica 4 riesgos pero la justificación es débil, o identifica y justifica bien solo 2-3 riesgos.</w:t>
+            </w:r>
+          </w:p>
+        </w:tc>
+        <w:tc>
+          <w:tcPr>
+            <w:tcW w:type="dxa" w:w="1728"/>
+          </w:tcPr>
+          <w:p>
+            <w:r>
+              <w:t>Identifica 1-2 riesgos con justificación insuficiente o errónea.</w:t>
+            </w:r>
+          </w:p>
+        </w:tc>
+        <w:tc>
+          <w:tcPr>
+            <w:tcW w:type="dxa" w:w="1728"/>
+          </w:tcPr>
+          <w:p>
+            <w:r>
+              <w:t>35 pts</w:t>
+            </w:r>
+          </w:p>
+        </w:tc>
+      </w:tr>
+      <w:tr>
+        <w:tc>
+          <w:tcPr>
+            <w:tcW w:type="dxa" w:w="1728"/>
+          </w:tcPr>
+          <w:p>
+            <w:r>
+              <w:t>2.1 Selección y Justificación de Controles de Acceso (Protect)</w:t>
+            </w:r>
+          </w:p>
+        </w:tc>
+        <w:tc>
+          <w:tcPr>
+            <w:tcW w:type="dxa" w:w="1728"/>
+          </w:tcPr>
+          <w:p>
+            <w:r>
+              <w:t>Cita 4 controles de acceso idóneos y justifica con claridad el motivo y relevancia de su implementación.</w:t>
+            </w:r>
+          </w:p>
+        </w:tc>
+        <w:tc>
+          <w:tcPr>
+            <w:tcW w:type="dxa" w:w="1728"/>
+          </w:tcPr>
+          <w:p>
+            <w:r>
+              <w:t>Cita 4 controles pero con justificaciones parciales, o justifica adecuadamente solo 2-3 controles.</w:t>
+            </w:r>
+          </w:p>
+        </w:tc>
+        <w:tc>
+          <w:tcPr>
+            <w:tcW w:type="dxa" w:w="1728"/>
+          </w:tcPr>
+          <w:p>
+            <w:r>
+              <w:t>Cita 1-2 controles con justificación deficiente o desconectada de la problemática.</w:t>
+            </w:r>
+          </w:p>
+        </w:tc>
+        <w:tc>
+          <w:tcPr>
+            <w:tcW w:type="dxa" w:w="1728"/>
+          </w:tcPr>
+          <w:p>
+            <w:r>
+              <w:t>35 pts</w:t>
+            </w:r>
+          </w:p>
+        </w:tc>
+      </w:tr>
+    </w:tbl>
     <w:sectPr>
       <w:pgSz w:w="12240" w:h="15840"/>
       <w:pgMar w:top="1440" w:right="1800" w:bottom="1440" w:left="1800" w:header="720" w:footer="720" w:gutter="0"/>
@@ -1697,10 +1718,6 @@
     <w:name w:val="Normal"/>
     <w:qFormat/>
     <w:rsid w:val="00FC693F"/>
-    <w:rPr>
-      <w:rFonts w:ascii="Times New Roman" w:hAnsi="Times New Roman"/>
-      <w:sz w:val="24"/>
-    </w:rPr>
   </w:style>
   <w:style w:type="paragraph" w:styleId="Header">
     <w:name w:val="header"/>

</xml_diff>